<commit_message>
Keep Niko secret until visual reveal
</commit_message>
<xml_diff>
--- a/exports/FUNKSTILLE_01_Vollstaendige_Handlung_Referenzpfad.docx
+++ b/exports/FUNKSTILLE_01_Vollstaendige_Handlung_Referenzpfad.docx
@@ -814,7 +814,7 @@
           <w:i/>
           <w:color w:val="0F6973"/>
         </w:rPr>
-        <w:t>Das ist Liv. Sie hat Niko immer aus dem Labor gejagt und ihm danach heimlich Fisch gegeben. Ich habe gestern noch mit ihr gestritten, weil sie meinen Kaffee weggeschüttet hat.</w:t>
+        <w:t>Das ist Liv. Ich habe gestern noch mit ihr gestritten, weil sie meinen Kaffee weggeschüttet hat. Sie hat behauptet, ich würde sonst irgendwann nur noch von Koffein und Trotz leben.</w:t>
       </w:r>
     </w:p>
     <w:p>
@@ -1143,7 +1143,7 @@
     </w:p>
     <w:p>
       <w:r>
-        <w:t>Kurz nach der Rückkehr fällt im Vorratsraum erneut etwas um. Mira erkennt diesmal ein kurzes, heiseres Miauen. Sie kennt den Laut:</w:t>
+        <w:t>Kurz nach der Rückkehr fällt im Vorratsraum erneut etwas um. Danach folgt ein kurzer, gepresster Laut. Mira kann weiterhin nicht erkennen, ob ein Mensch, ein Tier oder lose Fracht im Schrank eingeschlossen ist. Erst nachdem sie die Tür öffnet und das Tier mit eigenen Augen sieht, schreibt sie:</w:t>
       </w:r>
     </w:p>
     <w:p>
@@ -1156,7 +1156,7 @@
           <w:i/>
           <w:color w:val="0F6973"/>
         </w:rPr>
-        <w:t>Das war Niko. Livs Kater. Ich dachte, er wäre bei ihr gewesen.</w:t>
+        <w:t>Ich sehe ihn. Es ist Niko. Livs Kater. Ich dachte, er wäre bei ihr gewesen.</w:t>
       </w:r>
     </w:p>
     <w:p>

</xml_diff>